<commit_message>
engineering lead for the new Ditto Go SDK
</commit_message>
<xml_diff>
--- a/formats/kjresume.docx
+++ b/formats/kjresume.docx
@@ -2,7 +2,7 @@
 <file path=word/document.xml><?xml version="1.0" encoding="utf-8"?>
 <w:document xmlns:w="http://schemas.openxmlformats.org/wordprocessingml/2006/main" xmlns:m="http://schemas.openxmlformats.org/officeDocument/2006/math" xmlns:r="http://schemas.openxmlformats.org/officeDocument/2006/relationships" xmlns:o="urn:schemas-microsoft-com:office:office" xmlns:v="urn:schemas-microsoft-com:vml" xmlns:w10="urn:schemas-microsoft-com:office:word" xmlns:a="http://schemas.openxmlformats.org/drawingml/2006/main" xmlns:pic="http://schemas.openxmlformats.org/drawingml/2006/picture" xmlns:wp="http://schemas.openxmlformats.org/drawingml/2006/wordprocessingDrawing">
   <w:body>
-    <w:bookmarkStart w:id="38" w:name="kristopher-johnson"/>
+    <w:bookmarkStart w:id="26" w:name="kristopher-johnson"/>
     <w:p>
       <w:pPr>
         <w:pStyle w:val="Heading1"/>
@@ -18,272 +18,237 @@
       <w:r>
         <w:t xml:space="preserve">E-mail: kris@kristopherjohnson.net</w:t>
       </w:r>
+    </w:p>
+    <w:bookmarkStart w:id="9" w:name="summary"/>
+    <w:p>
+      <w:pPr>
+        <w:pStyle w:val="Heading2"/>
+      </w:pPr>
+      <w:r>
+        <w:t xml:space="preserve">Summary</w:t>
+      </w:r>
+    </w:p>
+    <w:p>
+      <w:pPr>
+        <w:pStyle w:val="FirstParagraph"/>
+      </w:pPr>
+      <w:r>
+        <w:t xml:space="preserve">Over 30 years of experience designing and implementing distributed systems and</w:t>
+      </w:r>
+      <w:r>
+        <w:t xml:space="preserve"> </w:t>
+      </w:r>
+      <w:r>
+        <w:t xml:space="preserve">user applications for mobile applications, transportation engineering, and</w:t>
+      </w:r>
+      <w:r>
+        <w:t xml:space="preserve"> </w:t>
+      </w:r>
+      <w:r>
+        <w:t xml:space="preserve">lottery/gaming industries, including service as lead developer for multiple</w:t>
+      </w:r>
+      <w:r>
+        <w:t xml:space="preserve"> </w:t>
+      </w:r>
+      <w:r>
+        <w:t xml:space="preserve">projects. Experienced with iOS and Android development, Microsoft Windows, macOS</w:t>
+      </w:r>
+      <w:r>
+        <w:t xml:space="preserve"> </w:t>
+      </w:r>
+      <w:r>
+        <w:t xml:space="preserve">and UNIX software development in C++, Go, Rust, C#, Objective-C, Swift, Java,</w:t>
+      </w:r>
+      <w:r>
+        <w:t xml:space="preserve"> </w:t>
+      </w:r>
+      <w:r>
+        <w:t xml:space="preserve">JavaScript and other programming languages, with relational database technology,</w:t>
+      </w:r>
+      <w:r>
+        <w:t xml:space="preserve"> </w:t>
+      </w:r>
+      <w:r>
+        <w:t xml:space="preserve">embedded systems, and distributed systems.</w:t>
+      </w:r>
+    </w:p>
+    <w:bookmarkEnd w:id="9"/>
+    <w:bookmarkStart w:id="16" w:name="skills"/>
+    <w:p>
+      <w:pPr>
+        <w:pStyle w:val="Heading2"/>
+      </w:pPr>
+      <w:r>
+        <w:t xml:space="preserve">Skills</w:t>
+      </w:r>
+    </w:p>
+    <w:bookmarkStart w:id="10" w:name="operating-systems"/>
+    <w:p>
+      <w:pPr>
+        <w:pStyle w:val="Heading3"/>
+      </w:pPr>
+      <w:r>
+        <w:t xml:space="preserve">Operating Systems</w:t>
+      </w:r>
+    </w:p>
+    <w:p>
+      <w:pPr>
+        <w:pStyle w:val="FirstParagraph"/>
+      </w:pPr>
+      <w:r>
+        <w:t xml:space="preserve">iOS, Android, Windows, macOS, Linux, Solaris/SunOS, AT&amp;T System V UNIX, QNX</w:t>
+      </w:r>
+      <w:r>
+        <w:t xml:space="preserve"> </w:t>
+      </w:r>
+      <w:r>
+        <w:t xml:space="preserve">Neutrino, VxWorks, OpenVMS, OS/2</w:t>
+      </w:r>
+    </w:p>
+    <w:bookmarkEnd w:id="10"/>
+    <w:bookmarkStart w:id="11" w:name="programming-languages"/>
+    <w:p>
+      <w:pPr>
+        <w:pStyle w:val="Heading3"/>
+      </w:pPr>
+      <w:r>
+        <w:t xml:space="preserve">Programming Languages</w:t>
+      </w:r>
+    </w:p>
+    <w:p>
+      <w:pPr>
+        <w:pStyle w:val="FirstParagraph"/>
+      </w:pPr>
+      <w:r>
+        <w:t xml:space="preserve">C++, Go, Rust Python, C#, C, Objective-C, Swift, Java, JavaScript, TypeScript,</w:t>
+      </w:r>
+      <w:r>
+        <w:t xml:space="preserve"> </w:t>
+      </w:r>
+      <w:r>
+        <w:t xml:space="preserve">Perl, Ruby, Bash</w:t>
+      </w:r>
+    </w:p>
+    <w:bookmarkEnd w:id="11"/>
+    <w:bookmarkStart w:id="12" w:name="development-tools"/>
+    <w:p>
+      <w:pPr>
+        <w:pStyle w:val="Heading3"/>
+      </w:pPr>
+      <w:r>
+        <w:t xml:space="preserve">Development Tools</w:t>
+      </w:r>
+    </w:p>
+    <w:p>
+      <w:pPr>
+        <w:pStyle w:val="FirstParagraph"/>
+      </w:pPr>
+      <w:r>
+        <w:t xml:space="preserve">Visual Studio Code, Microsoft Visual Studio, Xcode, Android Studio, Eclipse,</w:t>
+      </w:r>
+      <w:r>
+        <w:t xml:space="preserve"> </w:t>
+      </w:r>
+      <w:r>
+        <w:t xml:space="preserve">Java SDK, Clang and GNU compilers and toolchains</w:t>
+      </w:r>
+    </w:p>
+    <w:bookmarkEnd w:id="12"/>
+    <w:bookmarkStart w:id="13" w:name="certifications"/>
+    <w:p>
+      <w:pPr>
+        <w:pStyle w:val="Heading3"/>
+      </w:pPr>
+      <w:r>
+        <w:t xml:space="preserve">Certifications</w:t>
+      </w:r>
+    </w:p>
+    <w:p>
+      <w:pPr>
+        <w:pStyle w:val="FirstParagraph"/>
+      </w:pPr>
+      <w:r>
+        <w:t xml:space="preserve">AWS Certified Solutions Architect - Associate, AWS Certified Cloud Practitioner</w:t>
+      </w:r>
+    </w:p>
+    <w:bookmarkEnd w:id="13"/>
+    <w:bookmarkStart w:id="14" w:name="distributed-systems-technologies"/>
+    <w:p>
+      <w:pPr>
+        <w:pStyle w:val="Heading3"/>
+      </w:pPr>
+      <w:r>
+        <w:t xml:space="preserve">Distributed Systems Technologies</w:t>
+      </w:r>
+    </w:p>
+    <w:p>
+      <w:pPr>
+        <w:pStyle w:val="FirstParagraph"/>
+      </w:pPr>
+      <w:r>
+        <w:t xml:space="preserve">gRPC, REST, web services, RPC, .NET Remoting, CORBA, sockets</w:t>
+      </w:r>
+    </w:p>
+    <w:bookmarkEnd w:id="14"/>
+    <w:bookmarkStart w:id="15" w:name="database-systems"/>
+    <w:p>
+      <w:pPr>
+        <w:pStyle w:val="Heading3"/>
+      </w:pPr>
+      <w:r>
+        <w:t xml:space="preserve">Database Systems</w:t>
+      </w:r>
+    </w:p>
+    <w:p>
+      <w:pPr>
+        <w:pStyle w:val="FirstParagraph"/>
+      </w:pPr>
+      <w:r>
+        <w:t xml:space="preserve">PostgreSQL, Oracle, SQL Server, SQLite, MySQL, InfluxDB, Microsoft Access/Jet,</w:t>
+      </w:r>
+      <w:r>
+        <w:t xml:space="preserve"> </w:t>
+      </w:r>
+      <w:r>
+        <w:t xml:space="preserve">Paradox</w:t>
+      </w:r>
+    </w:p>
+    <w:bookmarkEnd w:id="15"/>
+    <w:bookmarkEnd w:id="16"/>
+    <w:bookmarkStart w:id="22" w:name="experience"/>
+    <w:p>
+      <w:pPr>
+        <w:pStyle w:val="Heading2"/>
+      </w:pPr>
+      <w:r>
+        <w:t xml:space="preserve">Experience</w:t>
+      </w:r>
+    </w:p>
+    <w:p>
+      <w:pPr>
+        <w:pStyle w:val="FirstParagraph"/>
+      </w:pPr>
+      <w:r>
+        <w:rPr>
+          <w:b/>
+          <w:bCs/>
+        </w:rPr>
+        <w:t xml:space="preserve">Jul 2024-Present</w:t>
+      </w:r>
       <w:r>
         <w:br/>
       </w:r>
       <w:r>
-        <w:t xml:space="preserve">Web Site:</w:t>
-      </w:r>
-      <w:r>
-        <w:t xml:space="preserve"> </w:t>
-      </w:r>
-      <w:hyperlink r:id="rId20">
-        <w:r>
-          <w:rPr>
-            <w:rStyle w:val="Hyperlink"/>
-          </w:rPr>
-          <w:t xml:space="preserve">https://undefinedvalue.com/</w:t>
-        </w:r>
-      </w:hyperlink>
-    </w:p>
-    <w:bookmarkStart w:id="21" w:name="summary"/>
-    <w:p>
-      <w:pPr>
-        <w:pStyle w:val="Heading2"/>
-      </w:pPr>
-      <w:r>
-        <w:t xml:space="preserve">Summary</w:t>
-      </w:r>
-    </w:p>
-    <w:p>
-      <w:pPr>
-        <w:pStyle w:val="FirstParagraph"/>
-      </w:pPr>
-      <w:r>
-        <w:t xml:space="preserve">Over 30 years of experience designing and implementing distributed systems and</w:t>
-      </w:r>
-      <w:r>
-        <w:t xml:space="preserve"> </w:t>
-      </w:r>
-      <w:r>
-        <w:t xml:space="preserve">user applications for the transportation engineering, lottery/gaming, and</w:t>
-      </w:r>
-      <w:r>
-        <w:t xml:space="preserve"> </w:t>
-      </w:r>
-      <w:r>
-        <w:t xml:space="preserve">enterprise mobile app testing industries, including service as lead developer</w:t>
-      </w:r>
-      <w:r>
-        <w:t xml:space="preserve"> </w:t>
-      </w:r>
-      <w:r>
-        <w:t xml:space="preserve">for multiple projects. Experienced with iOS and Android development, Microsoft</w:t>
-      </w:r>
-      <w:r>
-        <w:t xml:space="preserve"> </w:t>
-      </w:r>
-      <w:r>
-        <w:t xml:space="preserve">Windows, macOS and UNIX software development in Rust, C#, Objective-C, Swift,</w:t>
-      </w:r>
-      <w:r>
-        <w:t xml:space="preserve"> </w:t>
-      </w:r>
-      <w:r>
-        <w:t xml:space="preserve">C++, Java, JavaScript and other programming languages, with relational database</w:t>
-      </w:r>
-      <w:r>
-        <w:t xml:space="preserve"> </w:t>
-      </w:r>
-      <w:r>
-        <w:t xml:space="preserve">technology, embedded systems, and distributed systems.</w:t>
-      </w:r>
-    </w:p>
-    <w:bookmarkEnd w:id="21"/>
-    <w:bookmarkStart w:id="29" w:name="skills"/>
-    <w:p>
-      <w:pPr>
-        <w:pStyle w:val="Heading2"/>
-      </w:pPr>
-      <w:r>
-        <w:t xml:space="preserve">Skills</w:t>
-      </w:r>
-    </w:p>
-    <w:bookmarkStart w:id="22" w:name="operating-systems"/>
-    <w:p>
-      <w:pPr>
-        <w:pStyle w:val="Heading3"/>
-      </w:pPr>
-      <w:r>
-        <w:t xml:space="preserve">Operating Systems</w:t>
-      </w:r>
-    </w:p>
-    <w:p>
-      <w:pPr>
-        <w:pStyle w:val="FirstParagraph"/>
-      </w:pPr>
-      <w:r>
-        <w:t xml:space="preserve">iOS, Android, Windows, macOS, Linux, Solaris/SunOS, AT&amp;T System V UNIX, QNX</w:t>
-      </w:r>
-      <w:r>
-        <w:t xml:space="preserve"> </w:t>
-      </w:r>
-      <w:r>
-        <w:t xml:space="preserve">Neutrino, VxWorks, OpenVMS, OS/2</w:t>
-      </w:r>
-    </w:p>
-    <w:bookmarkEnd w:id="22"/>
-    <w:bookmarkStart w:id="23" w:name="programming-languages"/>
-    <w:p>
-      <w:pPr>
-        <w:pStyle w:val="Heading3"/>
-      </w:pPr>
-      <w:r>
-        <w:t xml:space="preserve">Programming Languages</w:t>
-      </w:r>
-    </w:p>
-    <w:p>
-      <w:pPr>
-        <w:pStyle w:val="FirstParagraph"/>
-      </w:pPr>
-      <w:r>
-        <w:t xml:space="preserve">Rust, C++, Python, C#, C, Objective-C, Swift, Java, JavaScript, TypeScript,</w:t>
-      </w:r>
-      <w:r>
-        <w:t xml:space="preserve"> </w:t>
-      </w:r>
-      <w:r>
-        <w:t xml:space="preserve">Perl, Ruby, Bash</w:t>
-      </w:r>
-    </w:p>
-    <w:bookmarkEnd w:id="23"/>
-    <w:bookmarkStart w:id="24" w:name="development-tools"/>
-    <w:p>
-      <w:pPr>
-        <w:pStyle w:val="Heading3"/>
-      </w:pPr>
-      <w:r>
-        <w:t xml:space="preserve">Development Tools</w:t>
-      </w:r>
-    </w:p>
-    <w:p>
-      <w:pPr>
-        <w:pStyle w:val="FirstParagraph"/>
-      </w:pPr>
-      <w:r>
-        <w:t xml:space="preserve">Visual Studio Code, Microsoft Visual Studio, Xcode, Android Studio, Eclipse,</w:t>
-      </w:r>
-      <w:r>
-        <w:t xml:space="preserve"> </w:t>
-      </w:r>
-      <w:r>
-        <w:t xml:space="preserve">Java SDK, Clang and GNU compilers and toolchains</w:t>
-      </w:r>
-    </w:p>
-    <w:bookmarkEnd w:id="24"/>
-    <w:bookmarkStart w:id="25" w:name="certifications"/>
-    <w:p>
-      <w:pPr>
-        <w:pStyle w:val="Heading3"/>
-      </w:pPr>
-      <w:r>
-        <w:t xml:space="preserve">Certifications</w:t>
-      </w:r>
-    </w:p>
-    <w:p>
-      <w:pPr>
-        <w:pStyle w:val="FirstParagraph"/>
-      </w:pPr>
-      <w:r>
-        <w:t xml:space="preserve">AWS Certified Solutions Architect - Associate, AWS Certified Cloud Practitioner</w:t>
-      </w:r>
-    </w:p>
-    <w:bookmarkEnd w:id="25"/>
-    <w:bookmarkStart w:id="26" w:name="distributed-systems-technologies"/>
-    <w:p>
-      <w:pPr>
-        <w:pStyle w:val="Heading3"/>
-      </w:pPr>
-      <w:r>
-        <w:t xml:space="preserve">Distributed Systems Technologies</w:t>
-      </w:r>
-    </w:p>
-    <w:p>
-      <w:pPr>
-        <w:pStyle w:val="FirstParagraph"/>
-      </w:pPr>
-      <w:r>
-        <w:t xml:space="preserve">gRPC, REST services, web services, CORBA, DCOM, RPC, .NET Remoting, sockets</w:t>
-      </w:r>
-    </w:p>
-    <w:bookmarkEnd w:id="26"/>
-    <w:bookmarkStart w:id="27" w:name="component-technologies"/>
-    <w:p>
-      <w:pPr>
-        <w:pStyle w:val="Heading3"/>
-      </w:pPr>
-      <w:r>
-        <w:t xml:space="preserve">Component Technologies</w:t>
-      </w:r>
-    </w:p>
-    <w:p>
-      <w:pPr>
-        <w:pStyle w:val="FirstParagraph"/>
-      </w:pPr>
-      <w:r>
-        <w:t xml:space="preserve">.NET, Java EE, ActiveX/OLE/COM, Dynamic Link Libraries and Shared Objects</w:t>
-      </w:r>
-    </w:p>
-    <w:bookmarkEnd w:id="27"/>
-    <w:bookmarkStart w:id="28" w:name="database-systems"/>
-    <w:p>
-      <w:pPr>
-        <w:pStyle w:val="Heading3"/>
-      </w:pPr>
-      <w:r>
-        <w:t xml:space="preserve">Database Systems</w:t>
-      </w:r>
-    </w:p>
-    <w:p>
-      <w:pPr>
-        <w:pStyle w:val="FirstParagraph"/>
-      </w:pPr>
-      <w:r>
-        <w:t xml:space="preserve">PostgreSQL, Oracle, SQL Server, SQLite, MySQL, InfluxDB, Microsoft Access/Jet,</w:t>
-      </w:r>
-      <w:r>
-        <w:t xml:space="preserve"> </w:t>
-      </w:r>
-      <w:r>
-        <w:t xml:space="preserve">Paradox</w:t>
-      </w:r>
-    </w:p>
-    <w:bookmarkEnd w:id="28"/>
-    <w:bookmarkEnd w:id="29"/>
-    <w:bookmarkStart w:id="34" w:name="experience"/>
-    <w:p>
-      <w:pPr>
-        <w:pStyle w:val="Heading2"/>
-      </w:pPr>
-      <w:r>
-        <w:t xml:space="preserve">Experience</w:t>
-      </w:r>
-    </w:p>
-    <w:p>
-      <w:pPr>
-        <w:pStyle w:val="FirstParagraph"/>
-      </w:pPr>
-      <w:r>
-        <w:rPr>
-          <w:b/>
-          <w:bCs/>
-        </w:rPr>
-        <w:t xml:space="preserve">Jul 2024-Present</w:t>
+        <w:rPr>
+          <w:b/>
+          <w:bCs/>
+        </w:rPr>
+        <w:t xml:space="preserve">Senior Software Engineer</w:t>
       </w:r>
       <w:r>
         <w:br/>
       </w:r>
-      <w:r>
-        <w:rPr>
-          <w:b/>
-          <w:bCs/>
-        </w:rPr>
-        <w:t xml:space="preserve">Senior Software Engineer</w:t>
-      </w:r>
-      <w:r>
-        <w:br/>
-      </w:r>
-      <w:hyperlink r:id="rId30">
+      <w:hyperlink r:id="rId17">
         <w:r>
           <w:rPr>
             <w:rStyle w:val="Hyperlink"/>
@@ -299,39 +264,62 @@
         <w:pStyle w:val="BodyText"/>
       </w:pPr>
       <w:r>
-        <w:t xml:space="preserve">Member of the Ditto SDK engineering team. Personally responsible for evolution</w:t>
-      </w:r>
-      <w:r>
-        <w:t xml:space="preserve"> </w:t>
-      </w:r>
-      <w:r>
-        <w:t xml:space="preserve">and maintenance of the C++ SDK, and collaborated with other team members on the</w:t>
-      </w:r>
-      <w:r>
-        <w:t xml:space="preserve"> </w:t>
-      </w:r>
-      <w:r>
-        <w:t xml:space="preserve">SDKs for other programming languages. Worked with product management and</w:t>
-      </w:r>
-      <w:r>
-        <w:t xml:space="preserve"> </w:t>
-      </w:r>
-      <w:r>
-        <w:t xml:space="preserve">customers to implement new features and to provide escalated technical support.</w:t>
-      </w:r>
-    </w:p>
-    <w:p>
-      <w:pPr>
-        <w:pStyle w:val="BodyText"/>
-      </w:pPr>
-      <w:r>
-        <w:t xml:space="preserve">Worked with C++, Rust, Android, Swift, Java, and C# on iOS, Android, macOS, and</w:t>
-      </w:r>
-      <w:r>
-        <w:t xml:space="preserve"> </w:t>
-      </w:r>
-      <w:r>
-        <w:t xml:space="preserve">Linux.</w:t>
+        <w:t xml:space="preserve">Member of the</w:t>
+      </w:r>
+      <w:r>
+        <w:t xml:space="preserve"> </w:t>
+      </w:r>
+      <w:hyperlink r:id="rId18">
+        <w:r>
+          <w:rPr>
+            <w:rStyle w:val="Hyperlink"/>
+          </w:rPr>
+          <w:t xml:space="preserve">Ditto SDK</w:t>
+        </w:r>
+      </w:hyperlink>
+      <w:r>
+        <w:t xml:space="preserve"> </w:t>
+      </w:r>
+      <w:r>
+        <w:t xml:space="preserve">engineering team.</w:t>
+      </w:r>
+      <w:r>
+        <w:t xml:space="preserve"> </w:t>
+      </w:r>
+      <w:r>
+        <w:t xml:space="preserve">Engineering lead for the Go and C++ SDKs. Collaborated with other team members</w:t>
+      </w:r>
+      <w:r>
+        <w:t xml:space="preserve"> </w:t>
+      </w:r>
+      <w:r>
+        <w:t xml:space="preserve">on the SDKs for other programming languages, including Rust, Swift, Kotlin, and</w:t>
+      </w:r>
+      <w:r>
+        <w:t xml:space="preserve"> </w:t>
+      </w:r>
+      <w:r>
+        <w:t xml:space="preserve">C#. Worked with product management to define and implement new features.</w:t>
+      </w:r>
+      <w:r>
+        <w:t xml:space="preserve"> </w:t>
+      </w:r>
+      <w:r>
+        <w:t xml:space="preserve">Provided technical support and onsite troubleshooting for customers.</w:t>
+      </w:r>
+    </w:p>
+    <w:p>
+      <w:pPr>
+        <w:pStyle w:val="BodyText"/>
+      </w:pPr>
+      <w:r>
+        <w:t xml:space="preserve">Worked with C++, Go, Rust, Android, Swift, Java, and C# on iOS, Android, macOS,</w:t>
+      </w:r>
+      <w:r>
+        <w:t xml:space="preserve"> </w:t>
+      </w:r>
+      <w:r>
+        <w:t xml:space="preserve">and Linux.</w:t>
       </w:r>
     </w:p>
     <w:p>
@@ -358,7 +346,7 @@
       <w:r>
         <w:br/>
       </w:r>
-      <w:hyperlink r:id="rId31">
+      <w:hyperlink r:id="rId19">
         <w:r>
           <w:rPr>
             <w:rStyle w:val="Hyperlink"/>
@@ -859,7 +847,7 @@
       <w:r>
         <w:br/>
       </w:r>
-      <w:hyperlink r:id="rId32">
+      <w:hyperlink r:id="rId20">
         <w:r>
           <w:rPr>
             <w:rStyle w:val="Hyperlink"/>
@@ -1140,7 +1128,7 @@
       <w:r>
         <w:br/>
       </w:r>
-      <w:hyperlink r:id="rId33">
+      <w:hyperlink r:id="rId21">
         <w:r>
           <w:rPr>
             <w:rStyle w:val="Hyperlink"/>
@@ -1395,7 +1383,7 @@
       <w:r>
         <w:br/>
       </w:r>
-      <w:hyperlink r:id="rId33">
+      <w:hyperlink r:id="rId21">
         <w:r>
           <w:rPr>
             <w:rStyle w:val="Hyperlink"/>
@@ -1512,8 +1500,8 @@
         <w:t xml:space="preserve">and editing of traffic hazard information for the state of Minnesota.</w:t>
       </w:r>
     </w:p>
-    <w:bookmarkEnd w:id="34"/>
-    <w:bookmarkStart w:id="35" w:name="location"/>
+    <w:bookmarkEnd w:id="22"/>
+    <w:bookmarkStart w:id="23" w:name="location"/>
     <w:p>
       <w:pPr>
         <w:pStyle w:val="Heading2"/>
@@ -1530,8 +1518,8 @@
         <w:t xml:space="preserve">Currently living in the Atlanta, Georgia area. Willing to travel.</w:t>
       </w:r>
     </w:p>
-    <w:bookmarkEnd w:id="35"/>
-    <w:bookmarkStart w:id="36" w:name="education"/>
+    <w:bookmarkEnd w:id="23"/>
+    <w:bookmarkStart w:id="24" w:name="education"/>
     <w:p>
       <w:pPr>
         <w:pStyle w:val="Heading2"/>
@@ -1565,11 +1553,11 @@
         <w:br/>
       </w:r>
       <w:r>
-        <w:t xml:space="preserve">M.S., Computer Science, December 2025 (expected graduation date)</w:t>
-      </w:r>
-    </w:p>
-    <w:bookmarkEnd w:id="36"/>
-    <w:bookmarkStart w:id="37" w:name="other"/>
+        <w:t xml:space="preserve">M.S., Computer Science, December 2026 (expected graduation date)</w:t>
+      </w:r>
+    </w:p>
+    <w:bookmarkEnd w:id="24"/>
+    <w:bookmarkStart w:id="25" w:name="other"/>
     <w:p>
       <w:pPr>
         <w:pStyle w:val="Heading2"/>
@@ -1599,12 +1587,16 @@
         <w:pStyle w:val="BodyText"/>
       </w:pPr>
       <w:r>
-        <w:t xml:space="preserve">This document was last updated 2024-08-25.</w:t>
-      </w:r>
-    </w:p>
-    <w:bookmarkEnd w:id="37"/>
-    <w:bookmarkEnd w:id="38"/>
-    <w:sectPr/>
+        <w:t xml:space="preserve">This document was last updated 2025-11-02.</w:t>
+      </w:r>
+    </w:p>
+    <w:bookmarkEnd w:id="25"/>
+    <w:bookmarkEnd w:id="26"/>
+    <w:sectPr>
+      <w:footnotePr>
+        <w:numRestart w:val="eachSect"/>
+      </w:footnotePr>
+    </w:sectPr>
   </w:body>
 </w:document>
 </file>
@@ -1721,10 +1713,10 @@
   <w:docDefaults>
     <w:rPrDefault>
       <w:rPr>
-        <w:rFonts w:asciiTheme="minorHAnsi" w:cstheme="minorBidi" w:eastAsiaTheme="minorHAnsi" w:hAnsiTheme="minorHAnsi"/>
+        <w:rFonts w:asciiTheme="minorHAnsi" w:cstheme="minorBidi" w:eastAsiaTheme="minorEastAsia" w:hAnsiTheme="minorHAnsi"/>
         <w:sz w:val="24"/>
         <w:szCs w:val="24"/>
-        <w:lang w:bidi="ar-SA" w:eastAsia="en-US" w:val="en-US"/>
+        <w:lang w:bidi="ar-SA" w:eastAsia="zh-CN" w:val="en-US"/>
       </w:rPr>
     </w:rPrDefault>
     <w:pPrDefault>
@@ -1776,8 +1768,6 @@
     </w:pPr>
     <w:rPr>
       <w:rFonts w:asciiTheme="majorHAnsi" w:cstheme="majorBidi" w:eastAsiaTheme="majorEastAsia" w:hAnsiTheme="majorHAnsi"/>
-      <w:spacing w:val="-10"/>
-      <w:kern w:val="28"/>
       <w:sz w:val="56"/>
       <w:szCs w:val="56"/>
     </w:rPr>
@@ -1790,8 +1780,6 @@
     <w:rsid w:val="00A10FD9"/>
     <w:rPr>
       <w:rFonts w:asciiTheme="majorHAnsi" w:cstheme="majorBidi" w:eastAsiaTheme="majorEastAsia" w:hAnsiTheme="majorHAnsi"/>
-      <w:spacing w:val="-10"/>
-      <w:kern w:val="28"/>
       <w:sz w:val="56"/>
       <w:szCs w:val="56"/>
     </w:rPr>
@@ -1832,23 +1820,31 @@
   </w:style>
   <w:style w:customStyle="1" w:styleId="Author" w:type="paragraph">
     <w:name w:val="Author"/>
+    <w:basedOn w:val="Title"/>
     <w:next w:val="BodyText"/>
     <w:qFormat/>
     <w:pPr>
       <w:keepNext/>
       <w:keepLines/>
-      <w:jc w:val="center"/>
     </w:pPr>
+    <w:rPr>
+      <w:sz w:val="24"/>
+      <w:szCs w:val="24"/>
+    </w:rPr>
   </w:style>
   <w:style w:styleId="Date" w:type="paragraph">
     <w:name w:val="Date"/>
+    <w:basedOn w:val="Title"/>
     <w:next w:val="BodyText"/>
     <w:qFormat/>
     <w:pPr>
       <w:keepNext/>
       <w:keepLines/>
-      <w:jc w:val="center"/>
     </w:pPr>
+    <w:rPr>
+      <w:sz w:val="24"/>
+      <w:szCs w:val="24"/>
+    </w:rPr>
   </w:style>
   <w:style w:customStyle="1" w:styleId="AbstractTitle" w:type="paragraph">
     <w:name w:val="Abstract Title"/>
@@ -2261,13 +2257,6 @@
       </w:tblCellMar>
     </w:tblPr>
     <w:tblStylePr w:type="firstRow">
-      <w:tblPr>
-        <w:jc w:val="left"/>
-        <w:tblInd w:type="dxa" w:w="0"/>
-      </w:tblPr>
-      <w:trPr>
-        <w:jc w:val="left"/>
-      </w:trPr>
       <w:tcPr>
         <w:tcBorders>
           <w:bottom w:val="single"/>

</xml_diff>

<commit_message>
Update Ditto experience description
</commit_message>
<xml_diff>
--- a/formats/kjresume.docx
+++ b/formats/kjresume.docx
@@ -120,13 +120,13 @@
         <w:pStyle w:val="FirstParagraph"/>
       </w:pPr>
       <w:r>
-        <w:t xml:space="preserve">C++, Go, Rust Python, C#, C, Objective-C, Swift, Java, JavaScript, TypeScript,</w:t>
-      </w:r>
-      <w:r>
-        <w:t xml:space="preserve"> </w:t>
-      </w:r>
-      <w:r>
-        <w:t xml:space="preserve">Perl, Ruby, Bash</w:t>
+        <w:t xml:space="preserve">C++, Go, Rust, Python, C#, Swift, Kotlin, JavaScript, TypeScript,</w:t>
+      </w:r>
+      <w:r>
+        <w:t xml:space="preserve"> </w:t>
+      </w:r>
+      <w:r>
+        <w:t xml:space="preserve">C, Objective-C, Java, Perl, Ruby, Bash</w:t>
       </w:r>
     </w:p>
     <w:bookmarkEnd w:id="11"/>
@@ -283,29 +283,57 @@
       <w:r>
         <w:t xml:space="preserve">engineering team.</w:t>
       </w:r>
-      <w:r>
-        <w:t xml:space="preserve"> </w:t>
-      </w:r>
-      <w:r>
-        <w:t xml:space="preserve">Engineering lead for the Go and C++ SDKs. Collaborated with other team members</w:t>
-      </w:r>
-      <w:r>
-        <w:t xml:space="preserve"> </w:t>
-      </w:r>
-      <w:r>
-        <w:t xml:space="preserve">on the SDKs for other programming languages, including Rust, Swift, Kotlin, and</w:t>
-      </w:r>
-      <w:r>
-        <w:t xml:space="preserve"> </w:t>
-      </w:r>
-      <w:r>
-        <w:t xml:space="preserve">C#. Worked with product management to define and implement new features.</w:t>
+    </w:p>
+    <w:p>
+      <w:pPr>
+        <w:pStyle w:val="BodyText"/>
+      </w:pPr>
+      <w:r>
+        <w:t xml:space="preserve">Led development of a new Go SDK for Ditto. Engineering lead for the Rust and C++</w:t>
+      </w:r>
+      <w:r>
+        <w:t xml:space="preserve"> </w:t>
+      </w:r>
+      <w:r>
+        <w:t xml:space="preserve">SDKs. Collaborated with other team members on the SDKs for other programming</w:t>
+      </w:r>
+      <w:r>
+        <w:t xml:space="preserve"> </w:t>
+      </w:r>
+      <w:r>
+        <w:t xml:space="preserve">languages, including Swift, Kotlin, C#, JavaScript and TypeScript. The SDKs</w:t>
+      </w:r>
+      <w:r>
+        <w:t xml:space="preserve"> </w:t>
+      </w:r>
+      <w:r>
+        <w:t xml:space="preserve">target multiple platforms, including iOS, Android, Linux, Windows, and Raspberry</w:t>
+      </w:r>
+      <w:r>
+        <w:t xml:space="preserve"> </w:t>
+      </w:r>
+      <w:r>
+        <w:t xml:space="preserve">Pi.</w:t>
+      </w:r>
+    </w:p>
+    <w:p>
+      <w:pPr>
+        <w:pStyle w:val="BodyText"/>
+      </w:pPr>
+      <w:r>
+        <w:t xml:space="preserve">Worked with product management to define and implement new features.</w:t>
       </w:r>
       <w:r>
         <w:t xml:space="preserve"> </w:t>
       </w:r>
       <w:r>
         <w:t xml:space="preserve">Provided technical support and onsite troubleshooting for customers.</w:t>
+      </w:r>
+      <w:r>
+        <w:t xml:space="preserve"> </w:t>
+      </w:r>
+      <w:r>
+        <w:t xml:space="preserve">Built, tested, and shipped SDK software releases.</w:t>
       </w:r>
     </w:p>
     <w:p>

</xml_diff>

<commit_message>
updated Ditto experience description
</commit_message>
<xml_diff>
--- a/formats/kjresume.docx
+++ b/formats/kjresume.docx
@@ -341,13 +341,13 @@
         <w:pStyle w:val="BodyText"/>
       </w:pPr>
       <w:r>
-        <w:t xml:space="preserve">Worked with C++, Go, Rust, Android, Swift, Java, and C# on iOS, Android, macOS,</w:t>
-      </w:r>
-      <w:r>
-        <w:t xml:space="preserve"> </w:t>
-      </w:r>
-      <w:r>
-        <w:t xml:space="preserve">and Linux.</w:t>
+        <w:t xml:space="preserve">Championed use of Claude Code and other AI tools to research and resolve issues,</w:t>
+      </w:r>
+      <w:r>
+        <w:t xml:space="preserve"> </w:t>
+      </w:r>
+      <w:r>
+        <w:t xml:space="preserve">to update legacy code to new APIs, and to improve technical documentation.</w:t>
       </w:r>
     </w:p>
     <w:p>

</xml_diff>

<commit_message>
Update expected graduation date
</commit_message>
<xml_diff>
--- a/formats/kjresume.docx
+++ b/formats/kjresume.docx
@@ -1581,7 +1581,7 @@
         <w:br/>
       </w:r>
       <w:r>
-        <w:t xml:space="preserve">M.S., Computer Science, December 2026 (expected graduation date)</w:t>
+        <w:t xml:space="preserve">M.S., Computer Science, Expected graduation May 2027</w:t>
       </w:r>
     </w:p>
     <w:bookmarkEnd w:id="24"/>
@@ -1615,7 +1615,7 @@
         <w:pStyle w:val="BodyText"/>
       </w:pPr>
       <w:r>
-        <w:t xml:space="preserve">This document was last updated 2025-11-02.</w:t>
+        <w:t xml:space="preserve">This document was last updated 2026-06-19.</w:t>
       </w:r>
     </w:p>
     <w:bookmarkEnd w:id="25"/>

</xml_diff>